<commit_message>
Add backpressure, budgets, faults
</commit_message>
<xml_diff>
--- a/docs/DESIGN.docx
+++ b/docs/DESIGN.docx
@@ -25,14 +25,6 @@
       <w:pPr>
         <w:spacing w:after="60"/>
       </w:pPr>
-      <w:r>
-        <w:rPr>
-          <w:i/>
-          <w:sz w:val="18"/>
-          <w:szCs w:val="18"/>
-        </w:rPr>
-        <w:t>Staff Engineer take-home, Deliverable A.  PoC slice: LLM rate-limit, fairness and cost layer (Section 7).</w:t>
-      </w:r>
     </w:p>
     <w:p>
       <w:pPr>
@@ -1203,6 +1195,7 @@
         <w:rPr>
           <w:i/>
           <w:sz w:val="16"/>
+          <w:szCs w:val="16"/>
         </w:rPr>
         <w:t>Figure 2: see docs/limiter-diagram.mmd. One logical dispatcher in front of the single API key. Solid boxes are built in the PoC, dashed boxes are stretch goals, and the provider is faked.</w:t>
       </w:r>
@@ -1227,30 +1220,35 @@
       <w:r>
         <w:rPr>
           <w:b w:val="0"/>
+          <w:szCs w:val="19"/>
         </w:rPr>
         <w:t xml:space="preserve">1. </w:t>
       </w:r>
       <w:r>
         <w:rPr>
           <w:b/>
+          <w:szCs w:val="19"/>
         </w:rPr>
         <w:t>Admission.</w:t>
       </w:r>
       <w:r>
         <w:rPr>
           <w:b w:val="0"/>
+          <w:szCs w:val="19"/>
         </w:rPr>
         <w:t xml:space="preserve"> Each request carries {tenant, run, agent, class P0/P1/P2, est. input tokens, max output tokens}. The class is </w:t>
       </w:r>
       <w:r>
         <w:rPr>
           <w:b/>
+          <w:szCs w:val="19"/>
         </w:rPr>
         <w:t>derived by the platform from run state</w:t>
       </w:r>
       <w:r>
         <w:rPr>
           <w:b w:val="0"/>
+          <w:szCs w:val="19"/>
         </w:rPr>
         <w:t xml:space="preserve"> (P0 when a human is waiting on the run), never set by the agent or the tenant. Rejected immediately if the run or tenant budget is spent, the request exceeds the size cap, or the tenant's bounded queue is full.</w:t>
       </w:r>
@@ -1304,30 +1302,35 @@
       <w:r>
         <w:rPr>
           <w:b w:val="0"/>
+          <w:szCs w:val="19"/>
         </w:rPr>
         <w:t xml:space="preserve">3. </w:t>
       </w:r>
       <w:r>
         <w:rPr>
           <w:b/>
+          <w:szCs w:val="19"/>
         </w:rPr>
         <w:t>Fair dispatch.</w:t>
       </w:r>
       <w:r>
         <w:rPr>
           <w:b w:val="0"/>
+          <w:szCs w:val="19"/>
         </w:rPr>
         <w:t xml:space="preserve"> Deficit round robin across backlogged tenants, cost unit = reserved tokens, quantum proportional to tenant weight. Fairness is measured in tokens per rolling window, not in request count or wall time. It is work conserving (an idle tenant's share flows to others), and a quiet tenant waits at most one round regardless of how deep a noisy tenant's queue is. </w:t>
       </w:r>
       <w:r>
         <w:rPr>
           <w:b/>
+          <w:szCs w:val="19"/>
         </w:rPr>
         <w:t>The head request waits until it fits the buckets and is never skipped,</w:t>
       </w:r>
       <w:r>
         <w:rPr>
           <w:b w:val="0"/>
+          <w:szCs w:val="19"/>
         </w:rPr>
         <w:t xml:space="preserve"> so a large request cannot be starved by small ones. The cost is some idle quota while it waits; more keys shorten that wait at 10x.</w:t>
       </w:r>
@@ -1340,18 +1343,21 @@
       <w:r>
         <w:rPr>
           <w:b w:val="0"/>
+          <w:szCs w:val="19"/>
         </w:rPr>
         <w:t xml:space="preserve">4. </w:t>
       </w:r>
       <w:r>
         <w:rPr>
           <w:b/>
+          <w:szCs w:val="19"/>
         </w:rPr>
         <w:t>Priority.</w:t>
       </w:r>
       <w:r>
         <w:rPr>
           <w:b w:val="0"/>
+          <w:szCs w:val="19"/>
         </w:rPr>
         <w:t xml:space="preserve"> Within a tenant, strict P0 (blocks a human) &gt; P1 &gt; P2, with aging so P2 cannot starve. Across tenants, P0 heads are served ahead of P1/P2 heads, but only within each tenant's own P0 allowance (a token bucket), so a tenant gains nothing by flooding P0. P0 usage is audited.</w:t>
       </w:r>
@@ -1391,18 +1397,21 @@
       <w:r>
         <w:rPr>
           <w:b w:val="0"/>
+          <w:szCs w:val="19"/>
         </w:rPr>
         <w:t xml:space="preserve">6. </w:t>
       </w:r>
       <w:r>
         <w:rPr>
           <w:b/>
+          <w:szCs w:val="19"/>
         </w:rPr>
         <w:t>Accounting and budgets.</w:t>
       </w:r>
       <w:r>
         <w:rPr>
           <w:b w:val="0"/>
+          <w:szCs w:val="19"/>
         </w:rPr>
         <w:t xml:space="preserve"> Every call writes a ledger row (tenant, run, agent, model, input/output/cached tokens, cost, class, queue wait), a run event and a Splunk event. Per run token caps stop loops; per tenant daily budgets alert at 80% and hard stop at 100%.</w:t>
       </w:r>
@@ -1415,18 +1424,21 @@
       <w:r>
         <w:rPr>
           <w:b w:val="0"/>
+          <w:szCs w:val="19"/>
         </w:rPr>
         <w:t xml:space="preserve">7. </w:t>
       </w:r>
       <w:r>
         <w:rPr>
           <w:b/>
+          <w:szCs w:val="19"/>
         </w:rPr>
         <w:t>Stretch: adaptive control.</w:t>
       </w:r>
       <w:r>
         <w:rPr>
           <w:b w:val="0"/>
+          <w:szCs w:val="19"/>
         </w:rPr>
         <w:t xml:space="preserve"> On 429, Retry After or a latency spike, cut the dispatch rate multiplicatively and recover additively (AIMD), because the configured limit may be wrong or shared. Designed here; built only if time allows.</w:t>
       </w:r>
@@ -1439,30 +1451,35 @@
       <w:r>
         <w:rPr>
           <w:b w:val="0"/>
+          <w:szCs w:val="19"/>
         </w:rPr>
         <w:t xml:space="preserve">8. </w:t>
       </w:r>
       <w:r>
         <w:rPr>
           <w:b/>
+          <w:szCs w:val="19"/>
         </w:rPr>
         <w:t>Stretch: single leader with failover.</w:t>
       </w:r>
       <w:r>
         <w:rPr>
           <w:b w:val="0"/>
+          <w:szCs w:val="19"/>
         </w:rPr>
         <w:t xml:space="preserve"> One active dispatcher (leader lease in Postgres) plus a warm standby. A new leader </w:t>
       </w:r>
       <w:r>
         <w:rPr>
           <w:b/>
+          <w:szCs w:val="19"/>
         </w:rPr>
         <w:t>dispatches nothing for one window</w:t>
       </w:r>
       <w:r>
         <w:rPr>
           <w:b w:val="0"/>
+          <w:szCs w:val="19"/>
         </w:rPr>
         <w:t>, because the old leader's calls still count in the provider's sliding window; this under uses quota briefly but cannot overshoot it. A paused old leader can briefly overlap, and the 90% headroom is the buffer. Queues live in memory: losing them is safe because runs are durable and retry, at the cost of an occasional call paid twice.</w:t>
       </w:r>
@@ -1493,12 +1510,14 @@
       <w:r>
         <w:rPr>
           <w:b/>
+          <w:szCs w:val="19"/>
         </w:rPr>
         <w:t>What the PoC proves.</w:t>
       </w:r>
       <w:r>
         <w:rPr>
           <w:b w:val="0"/>
+          <w:szCs w:val="19"/>
         </w:rPr>
         <w:t xml:space="preserve"> Runs locally with one command (make demo), no Kubernetes (it adds nothing to this property). The scheduler core is a deterministic state machine with no I/O and an injected clock, driven by a discrete event simulator in virtual time, so every claim is exact and reproducible. A thin HTTP wrapper and a fake provider service run the same core live for the demo. The fake provider enforces a sliding window RPM/TPM limit, returns 429 with Retry After, and reports actual usage that differs from the estimates in both directions. The ledger is SQLite (Postgres in the design). Tests assert, with thresholds tuned in the PoC:</w:t>
       </w:r>
@@ -1592,18 +1611,21 @@
       <w:r>
         <w:rPr>
           <w:b w:val="0"/>
+          <w:szCs w:val="19"/>
         </w:rPr>
         <w:t xml:space="preserve">• </w:t>
       </w:r>
       <w:r>
         <w:rPr>
           <w:b/>
+          <w:szCs w:val="19"/>
         </w:rPr>
         <w:t>Estimate error and backpressure:</w:t>
       </w:r>
       <w:r>
         <w:rPr>
           <w:b w:val="0"/>
+          <w:szCs w:val="19"/>
         </w:rPr>
         <w:t xml:space="preserve"> ledger totals match provider reported usage exactly; bursts beyond queue bounds get retry_after and nothing is lost silently.</w:t>
       </w:r>
@@ -1615,48 +1637,56 @@
       <w:r>
         <w:rPr>
           <w:b/>
+          <w:szCs w:val="19"/>
         </w:rPr>
         <w:t>Real:</w:t>
       </w:r>
       <w:r>
         <w:rPr>
           <w:b w:val="0"/>
+          <w:szCs w:val="19"/>
         </w:rPr>
         <w:t xml:space="preserve"> admission, queues, DRR dispatcher, buckets, reconcile, accounting, backpressure. </w:t>
       </w:r>
       <w:r>
         <w:rPr>
           <w:b/>
+          <w:szCs w:val="19"/>
         </w:rPr>
         <w:t>Faked:</w:t>
       </w:r>
       <w:r>
         <w:rPr>
           <w:b w:val="0"/>
+          <w:szCs w:val="19"/>
         </w:rPr>
         <w:t xml:space="preserve"> the LLM provider, the agents, Postgres (SQLite), Kubernetes. </w:t>
       </w:r>
       <w:r>
         <w:rPr>
           <w:b/>
+          <w:szCs w:val="19"/>
         </w:rPr>
         <w:t>Known gaps:</w:t>
       </w:r>
       <w:r>
         <w:rPr>
           <w:b w:val="0"/>
+          <w:szCs w:val="19"/>
         </w:rPr>
         <w:t xml:space="preserve"> virtual time is exact but hides real concurrency and timing bugs, so the live HTTP demo is only a smoke test; AIMD and leader failover are designed above but are stretch goals. </w:t>
       </w:r>
       <w:r>
         <w:rPr>
           <w:b/>
+          <w:szCs w:val="19"/>
         </w:rPr>
         <w:t>Learned / what I would build second:</w:t>
       </w:r>
       <w:r>
         <w:rPr>
           <w:b w:val="0"/>
+          <w:szCs w:val="19"/>
         </w:rPr>
         <w:t xml:space="preserve"> to be completed after the build (README).</w:t>
       </w:r>
@@ -2029,6 +2059,7 @@
             <w:r>
               <w:rPr>
                 <w:sz w:val="16"/>
+                <w:szCs w:val="16"/>
               </w:rPr>
               <w:t>Standby takes over and dispatches nothing for one window (the old leader's calls still count at the provider). Stretch goal in the PoC.</w:t>
             </w:r>
@@ -2295,18 +2326,21 @@
       <w:r>
         <w:rPr>
           <w:b w:val="0"/>
+          <w:szCs w:val="19"/>
         </w:rPr>
         <w:t xml:space="preserve">Secret and PII redaction, retention and encryption in the event log; sandbox image supply chain and patching; authentication of human replies; review and signing of agent definitions; multi region and DR; sharing memory between agents (default is none, with explicit grants as a later feature); a real provider integration; AIMD and leader failover for the limiter (designed in Section 7, built only if time allows); and the </w:t>
       </w:r>
       <w:r>
         <w:rPr>
           <w:b/>
+          <w:szCs w:val="19"/>
         </w:rPr>
         <w:t>sandbox itself</w:t>
       </w:r>
       <w:r>
         <w:rPr>
           <w:b w:val="0"/>
+          <w:szCs w:val="19"/>
         </w:rPr>
         <w:t xml:space="preserve"> (isolation, cold start measurement and gVisor compatibility are unmeasured; the numbers in Section 5 are targets, not results). None of these changes the architecture, whereas the LLM quota can force one, which is why it got the build time.</w:t>
       </w:r>

</xml_diff>